<commit_message>
docs(update): update some docs
</commit_message>
<xml_diff>
--- a/Docs/docs to feed/Result-n200_corr.docx
+++ b/Docs/docs to feed/Result-n200_corr.docx
@@ -118,7 +118,7 @@
       <w:r>
         <w:rPr/>
         <w:drawing>
-          <wp:anchor behindDoc="0" distT="0" distB="0" distL="0" distR="0" simplePos="0" locked="0" layoutInCell="0" allowOverlap="1" relativeHeight="5">
+          <wp:anchor behindDoc="0" distT="0" distB="0" distL="0" distR="0" simplePos="0" locked="0" layoutInCell="0" allowOverlap="1" relativeHeight="4">
             <wp:simplePos x="0" y="0"/>
             <wp:positionH relativeFrom="column">
               <wp:align>center</wp:align>
@@ -282,17 +282,17 @@
       <w:r>
         <w:rPr/>
         <w:drawing>
-          <wp:anchor behindDoc="0" distT="0" distB="0" distL="0" distR="0" simplePos="0" locked="0" layoutInCell="0" allowOverlap="1" relativeHeight="4">
+          <wp:anchor behindDoc="0" distT="0" distB="0" distL="0" distR="0" simplePos="0" locked="0" layoutInCell="0" allowOverlap="1" relativeHeight="5">
             <wp:simplePos x="0" y="0"/>
             <wp:positionH relativeFrom="column">
-              <wp:align>center</wp:align>
+              <wp:posOffset>0</wp:posOffset>
             </wp:positionH>
             <wp:positionV relativeFrom="paragraph">
-              <wp:posOffset>635</wp:posOffset>
+              <wp:posOffset>166370</wp:posOffset>
             </wp:positionV>
             <wp:extent cx="6332220" cy="3977005"/>
             <wp:effectExtent l="0" t="0" r="0" b="0"/>
-            <wp:wrapSquare wrapText="largest"/>
+            <wp:wrapTopAndBottom/>
             <wp:docPr id="4" name="Image3" descr=""/>
             <wp:cNvGraphicFramePr>
               <a:graphicFrameLocks xmlns:a="http://schemas.openxmlformats.org/drawingml/2006/main" noChangeAspect="1"/>
@@ -326,6 +326,167 @@
             </a:graphic>
           </wp:anchor>
         </w:drawing>
+      </w:r>
+    </w:p>
+    <w:p>
+      <w:pPr>
+        <w:pStyle w:val="Normal"/>
+        <w:bidi w:val="0"/>
+        <w:jc w:val="left"/>
+        <w:rPr/>
+      </w:pPr>
+      <w:r>
+        <w:rPr/>
+      </w:r>
+    </w:p>
+    <w:p>
+      <w:pPr>
+        <w:pStyle w:val="Normal"/>
+        <w:bidi w:val="0"/>
+        <w:jc w:val="left"/>
+        <w:rPr/>
+      </w:pPr>
+      <w:r>
+        <w:rPr/>
+      </w:r>
+    </w:p>
+    <w:p>
+      <w:pPr>
+        <w:pStyle w:val="Normal"/>
+        <w:bidi w:val="0"/>
+        <w:jc w:val="left"/>
+        <w:rPr/>
+      </w:pPr>
+      <w:r>
+        <w:rPr/>
+      </w:r>
+      <w:r>
+        <w:br w:type="page"/>
+      </w:r>
+    </w:p>
+    <w:p>
+      <w:pPr>
+        <w:pStyle w:val="Normal"/>
+        <w:bidi w:val="0"/>
+        <w:jc w:val="left"/>
+        <w:rPr/>
+      </w:pPr>
+      <w:r>
+        <w:rPr/>
+      </w:r>
+    </w:p>
+    <w:p>
+      <w:pPr>
+        <w:pStyle w:val="Normal"/>
+        <w:bidi w:val="0"/>
+        <w:jc w:val="left"/>
+        <w:rPr/>
+      </w:pPr>
+      <w:r>
+        <w:rPr/>
+        <w:drawing>
+          <wp:anchor behindDoc="0" distT="0" distB="0" distL="0" distR="0" simplePos="0" locked="0" layoutInCell="0" allowOverlap="1" relativeHeight="6">
+            <wp:simplePos x="0" y="0"/>
+            <wp:positionH relativeFrom="column">
+              <wp:align>center</wp:align>
+            </wp:positionH>
+            <wp:positionV relativeFrom="paragraph">
+              <wp:posOffset>635</wp:posOffset>
+            </wp:positionV>
+            <wp:extent cx="6332220" cy="3917315"/>
+            <wp:effectExtent l="0" t="0" r="0" b="0"/>
+            <wp:wrapSquare wrapText="largest"/>
+            <wp:docPr id="5" name="Image5" descr=""/>
+            <wp:cNvGraphicFramePr>
+              <a:graphicFrameLocks xmlns:a="http://schemas.openxmlformats.org/drawingml/2006/main" noChangeAspect="1"/>
+            </wp:cNvGraphicFramePr>
+            <a:graphic xmlns:a="http://schemas.openxmlformats.org/drawingml/2006/main">
+              <a:graphicData uri="http://schemas.openxmlformats.org/drawingml/2006/picture">
+                <pic:pic xmlns:pic="http://schemas.openxmlformats.org/drawingml/2006/picture">
+                  <pic:nvPicPr>
+                    <pic:cNvPr id="5" name="Image5" descr=""/>
+                    <pic:cNvPicPr>
+                      <a:picLocks noChangeAspect="1" noChangeArrowheads="1"/>
+                    </pic:cNvPicPr>
+                  </pic:nvPicPr>
+                  <pic:blipFill>
+                    <a:blip r:embed="rId6"/>
+                    <a:stretch>
+                      <a:fillRect/>
+                    </a:stretch>
+                  </pic:blipFill>
+                  <pic:spPr bwMode="auto">
+                    <a:xfrm>
+                      <a:off x="0" y="0"/>
+                      <a:ext cx="6332220" cy="3917315"/>
+                    </a:xfrm>
+                    <a:prstGeom prst="rect">
+                      <a:avLst/>
+                    </a:prstGeom>
+                  </pic:spPr>
+                </pic:pic>
+              </a:graphicData>
+            </a:graphic>
+          </wp:anchor>
+        </w:drawing>
+      </w:r>
+    </w:p>
+    <w:p>
+      <w:pPr>
+        <w:pStyle w:val="Normal"/>
+        <w:bidi w:val="0"/>
+        <w:jc w:val="left"/>
+        <w:rPr/>
+      </w:pPr>
+      <w:r>
+        <w:rPr/>
+      </w:r>
+    </w:p>
+    <w:p>
+      <w:pPr>
+        <w:pStyle w:val="Normal"/>
+        <w:bidi w:val="0"/>
+        <w:jc w:val="left"/>
+        <w:rPr/>
+      </w:pPr>
+      <w:r>
+        <w:rPr/>
+      </w:r>
+    </w:p>
+    <w:p>
+      <w:pPr>
+        <w:pStyle w:val="Normal"/>
+        <w:bidi w:val="0"/>
+        <w:jc w:val="left"/>
+        <w:rPr/>
+      </w:pPr>
+      <w:r>
+        <w:rPr/>
+      </w:r>
+      <w:r>
+        <w:br w:type="page"/>
+      </w:r>
+    </w:p>
+    <w:p>
+      <w:pPr>
+        <w:pStyle w:val="Normal"/>
+        <w:bidi w:val="0"/>
+        <w:jc w:val="left"/>
+        <w:rPr/>
+      </w:pPr>
+      <w:r>
+        <w:rPr/>
+      </w:r>
+    </w:p>
+    <w:p>
+      <w:pPr>
+        <w:pStyle w:val="Normal"/>
+        <w:bidi w:val="0"/>
+        <w:jc w:val="left"/>
+        <w:rPr/>
+      </w:pPr>
+      <w:r>
+        <w:rPr/>
       </w:r>
     </w:p>
     <w:sectPr>

</xml_diff>